<commit_message>
minor edits for publication
</commit_message>
<xml_diff>
--- a/doc/manuscript_hkk_drought_sensitivity.docx
+++ b/doc/manuscript_hkk_drought_sensitivity.docx
@@ -1991,19 +1991,19 @@
         <w:t xml:space="preserve">”</w:t>
       </w:r>
       <w:r>
-        <w:t xml:space="preserve">, in the Huai Kha Khaeng Wildlife Sanctuary, Uthai Thani, Thailand.</w:t>
-      </w:r>
-      <w:r>
-        <w:t xml:space="preserve"> </w:t>
-      </w:r>
-      <w:r>
-        <w:t xml:space="preserve">This is a 50-hectare plot in dry seasonal evergreen forest, with mean annual precipitation of 1400 mm, mean annual temperature of 23.5° C and a strong dry season from November to April</w:t>
-      </w:r>
-      <w:r>
-        <w:t xml:space="preserve"> </w:t>
-      </w:r>
-      <w:r>
-        <w:t xml:space="preserve">(Anderson-Teixeira</w:t>
+        <w:t xml:space="preserve">, in the Huai Kha Khaeng Wildlife Sanctuary, Uthai Thani, Thailand (Appendix S1).</w:t>
+      </w:r>
+      <w:r>
+        <w:t xml:space="preserve"> </w:t>
+      </w:r>
+      <w:r>
+        <w:t xml:space="preserve">This is a 50-hectare plot in dry seasonal evergreen forest, with mean annual precipitation of 1400 mm, mean annual temperature of 23.5° C and a strong dry season from November to April (Appendix S2,</w:t>
+      </w:r>
+      <w:r>
+        <w:t xml:space="preserve"> </w:t>
+      </w:r>
+      <w:r>
+        <w:t xml:space="preserve">Anderson-Teixeira</w:t>
       </w:r>
       <w:r>
         <w:t xml:space="preserve"> </w:t>
@@ -2019,10 +2019,10 @@
         <w:t xml:space="preserve"> </w:t>
       </w:r>
       <w:r>
-        <w:t xml:space="preserve">2015)</w:t>
-      </w:r>
-      <w:r>
-        <w:t xml:space="preserve">.</w:t>
+        <w:t xml:space="preserve">(2015)</w:t>
+      </w:r>
+      <w:r>
+        <w:t xml:space="preserve">).</w:t>
       </w:r>
       <w:r>
         <w:t xml:space="preserve"> </w:t>
@@ -2246,7 +2246,7 @@
         <w:t xml:space="preserve"> </w:t>
       </w:r>
       <w:r>
-        <w:t xml:space="preserve">We first conducted quality control on window size measurements (see supplementary methods) and combined them with the diameter measurement at installation</w:t>
+        <w:t xml:space="preserve">We first conducted quality control on window size measurements (Appendix S3) and combined them with the diameter measurement at installation</w:t>
       </w:r>
       <w:r>
         <w:t xml:space="preserve"> </w:t>
@@ -2620,7 +2620,7 @@
         <w:pStyle w:val="BodyText"/>
       </w:pPr>
       <w:r>
-        <w:t xml:space="preserve">We conducted further quality control on increments (see supplementary methods for details) to assemble the final dataset.</w:t>
+        <w:t xml:space="preserve">We conducted further quality control on increments (Appendix S3) to assemble the final dataset.</w:t>
       </w:r>
       <w:r>
         <w:t xml:space="preserve"> </w:t>
@@ -2763,7 +2763,7 @@
         <w:pStyle w:val="BodyText"/>
       </w:pPr>
       <w:r>
-        <w:t xml:space="preserve">To characterise the three droughts, we used daily weather data obtained from publicly available data sources.</w:t>
+        <w:t xml:space="preserve">To characterise the three droughts, we used daily weather data obtained from publicly available data sources (Appendix S2).</w:t>
       </w:r>
       <w:r>
         <w:t xml:space="preserve"> </w:t>
@@ -3338,7 +3338,7 @@
         <w:pStyle w:val="BodyText"/>
       </w:pPr>
       <w:r>
-        <w:t xml:space="preserve">For the three drought years, we calculated growth sensitivity for each tree to each drought as a growth anomaly from its mean annual increment over the entire time series.</w:t>
+        <w:t xml:space="preserve">For the three drought years, we calculated growth sensitivity for each tree to each drought as a growth anomaly from its mean annual increment over the entire time series (Appendix S4).</w:t>
       </w:r>
     </w:p>
     <w:p>
@@ -3849,7 +3849,7 @@
         <w:t xml:space="preserve"> </w:t>
       </w:r>
       <w:r>
-        <w:t xml:space="preserve">For an alternate estimate of wetness independent of total upslope area (Topographic Position Index) and associated results, see supplementary material.</w:t>
+        <w:t xml:space="preserve">For an alternate estimate of wetness independent of total upslope area (Topographic Position Index) and associated results, see Appendix S8.</w:t>
       </w:r>
       <w:r>
         <w:t xml:space="preserve"> </w:t>
@@ -3868,6 +3868,12 @@
       </w:r>
       <w:r>
         <w:t xml:space="preserve">We estimated crown exposure for each tree and year using ground measurements of crown illumination index (CII) at the previous census, an ordinal variable from 1 to 5 (least to most exposed).</w:t>
+      </w:r>
+      <w:r>
+        <w:t xml:space="preserve"> </w:t>
+      </w:r>
+      <w:r>
+        <w:t xml:space="preserve">For distribution of variables, see Appendix S5.</w:t>
       </w:r>
     </w:p>
     <w:p>
@@ -4511,7 +4517,7 @@
         <w:pStyle w:val="FirstParagraph"/>
       </w:pPr>
       <w:r>
-        <w:t xml:space="preserve">Simultaneously modelling the effect of variables on sensitivity and the effect of DBH on CII in this way allows us to disentangle causual linkages while accounting for confounding effects.</w:t>
+        <w:t xml:space="preserve">Simultaneously modelling the effect of variables on sensitivity and the effect of DBH on CII in this way allows us to disentangle causual linkages while accounting for confounding effects (for residuals and tests of conditional independences see Appendix S6 and S7).</w:t>
       </w:r>
       <w:r>
         <w:t xml:space="preserve"> </w:t>
@@ -4523,7 +4529,7 @@
         <w:t xml:space="preserve"> </w:t>
       </w:r>
       <w:r>
-        <w:t xml:space="preserve">However, we also ran simpler models with species random effects only on the intercept, the results of which are reported in the Supplementary Material.</w:t>
+        <w:t xml:space="preserve">However, we also ran simpler models with species random effects only on the intercept, the results of which are reported in Appendix S9.</w:t>
       </w:r>
       <w:r>
         <w:t xml:space="preserve"> </w:t>
@@ -4553,7 +4559,7 @@
         <w:t xml:space="preserve"> </w:t>
       </w:r>
       <w:r>
-        <w:t xml:space="preserve">Details and results are reported in the Supplementary Material.</w:t>
+        <w:t xml:space="preserve">Details and results are reported in Appendix S10.</w:t>
       </w:r>
       <w:r>
         <w:t xml:space="preserve"> </w:t>

</xml_diff>